<commit_message>
TP2: actualiza el Word resuelto con los hashes de commit vigentes
</commit_message>
<xml_diff>
--- a/docs/TP2_Laboratorio_Concurrencia_IA_resuelto.docx
+++ b/docs/TP2_Laboratorio_Concurrencia_IA_resuelto.docx
@@ -3298,7 +3298,7 @@
           <w:sz w:val="18"/>
           <w:szCs w:val="18"/>
         </w:rPr>
-        <w:t xml:space="preserve">89162c2 TP2 Parte 0: protocolo de seguridad (copia, transacción, respaldo) adaptado al entorno local</w:t>
+        <w:t xml:space="preserve">43b1416 TP2 Parte 0: protocolo de seguridad (copia, transacción, respaldo) adaptado al entorno local</w:t>
       </w:r>
     </w:p>
     <w:p>
@@ -9364,7 +9364,7 @@
                 <w:sz w:val="16"/>
                 <w:szCs w:val="16"/>
               </w:rPr>
-              <w:t xml:space="preserve">commit c4e3d56</w:t>
+              <w:t xml:space="preserve">commit 70bf66b</w:t>
             </w:r>
           </w:p>
           <w:p>
@@ -35539,91 +35539,91 @@
                 <w:sz w:val="16"/>
                 <w:szCs w:val="16"/>
               </w:rPr>
-              <w:t xml:space="preserve">db66a8a Datos de carga inicial (ficticios) de Food Store para el TP2</w:t>
-            </w:r>
-          </w:p>
-          <w:p>
-            <w:pPr>
-              <w:spacing w:after="0" w:line="240"/>
-            </w:pPr>
-            <w:r>
-              <w:rPr>
-                <w:rFonts w:ascii="Consolas" w:cs="Consolas" w:eastAsia="Consolas" w:hAnsi="Consolas"/>
-                <w:color w:val="1A1A1A"/>
-                <w:sz w:val="16"/>
-                <w:szCs w:val="16"/>
-              </w:rPr>
-              <w:t xml:space="preserve">89162c2 TP2 Parte 0: protocolo de seguridad (copia, transacción, respaldo) adaptado al entorno local</w:t>
-            </w:r>
-          </w:p>
-          <w:p>
-            <w:pPr>
-              <w:spacing w:after="0" w:line="240"/>
-            </w:pPr>
-            <w:r>
-              <w:rPr>
-                <w:rFonts w:ascii="Consolas" w:cs="Consolas" w:eastAsia="Consolas" w:hAnsi="Consolas"/>
-                <w:color w:val="1A1A1A"/>
-                <w:sz w:val="16"/>
-                <w:szCs w:val="16"/>
-              </w:rPr>
-              <w:t xml:space="preserve">155f3b3 TP2 Parte 0: AGENTS.md y steering de Kiro con las convenciones del esquema (IDENTITY, baja lógica R7, ENUM forma_pago)</w:t>
-            </w:r>
-          </w:p>
-          <w:p>
-            <w:pPr>
-              <w:spacing w:after="0" w:line="240"/>
-            </w:pPr>
-            <w:r>
-              <w:rPr>
-                <w:rFonts w:ascii="Consolas" w:cs="Consolas" w:eastAsia="Consolas" w:hAnsi="Consolas"/>
-                <w:color w:val="1A1A1A"/>
-                <w:sz w:val="16"/>
-                <w:szCs w:val="16"/>
-              </w:rPr>
-              <w:t xml:space="preserve">c4e3d56 Garantiza en el motor 3 reglas de Food Store: RN1 no se vende un producto dado de baja; RN2 cada línea de pedido descuenta stock y se rechaza si no alcanza; RN3 no se da de baja una categoría con productos activos (triggers)</w:t>
-            </w:r>
-          </w:p>
-          <w:p>
-            <w:pPr>
-              <w:spacing w:after="0" w:line="240"/>
-            </w:pPr>
-            <w:r>
-              <w:rPr>
-                <w:rFonts w:ascii="Consolas" w:cs="Consolas" w:eastAsia="Consolas" w:hAnsi="Consolas"/>
-                <w:color w:val="1A1A1A"/>
-                <w:sz w:val="16"/>
-                <w:szCs w:val="16"/>
-              </w:rPr>
-              <w:t xml:space="preserve">18cf9cd TP2 Parte 2: informe_concurrencia.md (4 escenarios verificados en el motor) + DUIA; scripts del laboratorio de dos sesiones</w:t>
-            </w:r>
-          </w:p>
-          <w:p>
-            <w:pPr>
-              <w:spacing w:after="0" w:line="240"/>
-            </w:pPr>
-            <w:r>
-              <w:rPr>
-                <w:rFonts w:ascii="Consolas" w:cs="Consolas" w:eastAsia="Consolas" w:hAnsi="Consolas"/>
-                <w:color w:val="1A1A1A"/>
-                <w:sz w:val="16"/>
-                <w:szCs w:val="16"/>
-              </w:rPr>
-              <w:t xml:space="preserve">54be34a TP2 Parte 3: ejercicio_lectura_critica.md (UPDATE sin WHERE, NOT IN con NULL y traslado a Food Store con baja lógica R7) + DUIA</w:t>
-            </w:r>
-          </w:p>
-          <w:p>
-            <w:pPr>
-              <w:spacing w:after="0" w:line="240"/>
-            </w:pPr>
-            <w:r>
-              <w:rPr>
-                <w:rFonts w:ascii="Consolas" w:cs="Consolas" w:eastAsia="Consolas" w:hAnsi="Consolas"/>
-                <w:color w:val="1A1A1A"/>
-                <w:sz w:val="16"/>
-                <w:szCs w:val="16"/>
-              </w:rPr>
-              <w:t xml:space="preserve">2169299 TP2 Parte 1: DUIA de las restricciones de integridad</w:t>
+              <w:t xml:space="preserve">1638232 Datos de carga inicial (ficticios) de Food Store para el TP2</w:t>
+            </w:r>
+          </w:p>
+          <w:p>
+            <w:pPr>
+              <w:spacing w:after="0" w:line="240"/>
+            </w:pPr>
+            <w:r>
+              <w:rPr>
+                <w:rFonts w:ascii="Consolas" w:cs="Consolas" w:eastAsia="Consolas" w:hAnsi="Consolas"/>
+                <w:color w:val="1A1A1A"/>
+                <w:sz w:val="16"/>
+                <w:szCs w:val="16"/>
+              </w:rPr>
+              <w:t xml:space="preserve">43b1416 TP2 Parte 0: protocolo de seguridad (copia, transacción, respaldo) adaptado al entorno local</w:t>
+            </w:r>
+          </w:p>
+          <w:p>
+            <w:pPr>
+              <w:spacing w:after="0" w:line="240"/>
+            </w:pPr>
+            <w:r>
+              <w:rPr>
+                <w:rFonts w:ascii="Consolas" w:cs="Consolas" w:eastAsia="Consolas" w:hAnsi="Consolas"/>
+                <w:color w:val="1A1A1A"/>
+                <w:sz w:val="16"/>
+                <w:szCs w:val="16"/>
+              </w:rPr>
+              <w:t xml:space="preserve">cf26a05 TP2 Parte 0: AGENTS.md y steering de Kiro con las convenciones del esquema (IDENTITY, baja lógica R7, ENUM forma_pago)</w:t>
+            </w:r>
+          </w:p>
+          <w:p>
+            <w:pPr>
+              <w:spacing w:after="0" w:line="240"/>
+            </w:pPr>
+            <w:r>
+              <w:rPr>
+                <w:rFonts w:ascii="Consolas" w:cs="Consolas" w:eastAsia="Consolas" w:hAnsi="Consolas"/>
+                <w:color w:val="1A1A1A"/>
+                <w:sz w:val="16"/>
+                <w:szCs w:val="16"/>
+              </w:rPr>
+              <w:t xml:space="preserve">70bf66b Garantiza en el motor 3 reglas de Food Store: RN1 no se vende un producto dado de baja; RN2 cada línea de pedido descuenta stock y se rechaza si no alcanza; RN3 no se da de baja una categoría con productos activos (triggers)</w:t>
+            </w:r>
+          </w:p>
+          <w:p>
+            <w:pPr>
+              <w:spacing w:after="0" w:line="240"/>
+            </w:pPr>
+            <w:r>
+              <w:rPr>
+                <w:rFonts w:ascii="Consolas" w:cs="Consolas" w:eastAsia="Consolas" w:hAnsi="Consolas"/>
+                <w:color w:val="1A1A1A"/>
+                <w:sz w:val="16"/>
+                <w:szCs w:val="16"/>
+              </w:rPr>
+              <w:t xml:space="preserve">b872aca TP2 Parte 2: informe_concurrencia.md (4 escenarios verificados en el motor) + DUIA; scripts del laboratorio de dos sesiones</w:t>
+            </w:r>
+          </w:p>
+          <w:p>
+            <w:pPr>
+              <w:spacing w:after="0" w:line="240"/>
+            </w:pPr>
+            <w:r>
+              <w:rPr>
+                <w:rFonts w:ascii="Consolas" w:cs="Consolas" w:eastAsia="Consolas" w:hAnsi="Consolas"/>
+                <w:color w:val="1A1A1A"/>
+                <w:sz w:val="16"/>
+                <w:szCs w:val="16"/>
+              </w:rPr>
+              <w:t xml:space="preserve">f00e769 TP2 Parte 3: ejercicio_lectura_critica.md (UPDATE sin WHERE, NOT IN con NULL y traslado a Food Store con baja lógica R7) + DUIA</w:t>
+            </w:r>
+          </w:p>
+          <w:p>
+            <w:pPr>
+              <w:spacing w:after="0" w:line="240"/>
+            </w:pPr>
+            <w:r>
+              <w:rPr>
+                <w:rFonts w:ascii="Consolas" w:cs="Consolas" w:eastAsia="Consolas" w:hAnsi="Consolas"/>
+                <w:color w:val="1A1A1A"/>
+                <w:sz w:val="16"/>
+                <w:szCs w:val="16"/>
+              </w:rPr>
+              <w:t xml:space="preserve">f38da9e TP2 Parte 1: DUIA de las restricciones de integridad</w:t>
             </w:r>
           </w:p>
         </w:tc>

</xml_diff>